<commit_message>
Lane-B: remove WIP Appendix Z from thesis_27
</commit_message>
<xml_diff>
--- a/manuscript/thesis_27.docx
+++ b/manuscript/thesis_27.docx
@@ -10306,61 +10306,6 @@
         </w:tc>
       </w:tr>
     </w:tbl>
-    <w:p>
-      <w:pPr>
-        <w:pStyle w:val="Heading1"/>
-      </w:pPr>
-      <w:r>
-        <w:t>⚠ WIP — REMOVE BEFORE SUBMISSION — Appendix Z: Work in Progress</w:t>
-      </w:r>
-    </w:p>
-    <w:p>
-      <w:r>
-        <w:t>⚠ UYARI: Bu bölüm tez teslim edilmeden önce kaldırılmalıdır. Aşağıdaki notlar, yazım süreci devam ederken açık kalan aksiyon maddelerini ve sürmekte olan WP5.5 çalışmasının durumunu derler.</w:t>
-      </w:r>
-    </w:p>
-    <w:p>
-      <w:r>
-        <w:t>Açık iş maddeleri ve notlar:</w:t>
-      </w:r>
-    </w:p>
-    <w:p>
-      <w:pPr>
-        <w:pStyle w:val="ListParagraph"/>
-      </w:pPr>
-      <w:r>
-        <w:t>(1) WP5.5 — Manipülasyon Geçerlilik Denetimi: §4.9'da raporlanan audit, kanonik operating point altında yeniden koşulmuştur (run ID: 20260422-170037_seed123_wp55-signal-audit_66fc17e); direction, separation ve coarsen_safety PASS, monotonicity FAIL, genel öneri REVIEW. Monotonicity değerlendirme ekseninin yeniden tasarlanması gelecek çalışma listesine alınmıştır.</w:t>
-      </w:r>
-    </w:p>
-    <w:p>
-      <w:pPr>
-        <w:pStyle w:val="ListParagraph"/>
-      </w:pPr>
-      <w:r>
-        <w:t>(2) Misspec-mild ortam farkı: §4.8'de raporlanan misspec-mild deneyleri sigma_mult = [0.5, 1.0, 2.0] / warmup = 400 ile yürütülmüştür; kanonik ortam [0.6, 1.0, 1.8] / warmup = 1000. Yeniden üretim gerçekleştirilmedi; §4.8'e retrospektif ortam uyarısı paragrafı eklenmiştir (bkz. Decisions Log #42, #45).</w:t>
-      </w:r>
-    </w:p>
-    <w:p>
-      <w:pPr>
-        <w:pStyle w:val="ListParagraph"/>
-      </w:pPr>
-      <w:r>
-        <w:t>(3) Canonical operating point kaydı: dt = 0.2, sigma_mid_ticks = 0.8, sigma_mult = [0.6, 1.0, 1.8], warmup_steps = 1000, rv_window = 50, n_steps = 8000, exec = {A=5.0, k=1.5, fee_bps=0.2, latency_steps=1}, 3×3 sticky trans_matrix. Yeni ilave deneyler bu referansı kullanmalıdır.</w:t>
-      </w:r>
-    </w:p>
-    <w:p>
-      <w:pPr>
-        <w:pStyle w:val="ListParagraph"/>
-      </w:pPr>
-      <w:r>
-        <w:t>(4) Teslim öncesi kontrol listesi: (a) bu Appendix Z bölümünü kaldır, (b) kapak sayfasındaki 'Sürüm 27' işaretçisini nihai sürüm numarasıyla değiştir, (c) WP5.5 audit tablosunda (Tablo 8) değerlerin en güncel audit_summary.md ile eşleştiğini doğrula.</w:t>
-      </w:r>
-    </w:p>
-    <w:p>
-      <w:r>
-        <w:t>Bu bölüm bilinçli olarak görünür bir başlıkla işaretlenmiştir; otomatik inceleme yapan okuyucuların (Codex denetimi dahil) bölümü yanlışlıkla atlamaması için başlık 'REMOVE BEFORE SUBMISSION' ifadesini içerir.</w:t>
-      </w:r>
-    </w:p>
     <w:sectPr>
       <w:pgSz w:w="12240" w:h="15840"/>
       <w:pgMar w:top="1440" w:right="1800" w:bottom="1440" w:left="1800" w:header="720" w:footer="720" w:gutter="0"/>

</xml_diff>

<commit_message>
Lane-A: add C1/C2/C3 caveats to thesis (§3.3, §3.8/§4.1, §5.1); produce thesis_28
</commit_message>
<xml_diff>
--- a/manuscript/thesis_27.docx
+++ b/manuscript/thesis_27.docx
@@ -2551,6 +2551,11 @@
       </w:r>
     </w:p>
     <w:p>
+      <w:r>
+        <w:t>Not: rv_dwell offline bir dwell smoothing kullanır ve etiket kararı verilirken sınırlı bir ileri tarama içerir (en fazla min_dwell adım); bu nedenle rv_dwell doğruluk değeri kausal bir üst sınır olarak okunmalıdır. Bu sınırlama yalnızca §3.3 ve §4.6'da raporlanan rv_dwell metriklerini etkiler; tezde raporlanan tüm ana boru hatları — WP4 pilot, WP5 OOS değerlendirmesi ve WP6 sweep — kausal rv_baseline detector'ı kullandığından, Bulgu 1-7 bu sınırlamadan etkilenmemiştir.</w:t>
+      </w:r>
+    </w:p>
+    <w:p>
       <w:pPr>
         <w:pStyle w:val="Heading2"/>
       </w:pPr>
@@ -3218,7 +3223,7 @@
     </w:tbl>
     <w:p>
       <w:r>
-        <w:t>Her seed için episode uzunluğu 8000 adım olup kronolojik eğitim/test bölünmesi %70/%30 (train: 5600, test: 2400 adım) şeklinde uygulanmıştır. Değerlendirme yalnızca test bölümünden gerçekleştirilmektedir. Toplam 20 bağımsız tohum kullanılmıştır (seeds: 1-20).</w:t>
+        <w:t>Her seed için episode uzunluğu 8000 adım olup kronolojik eğitim/test bölünmesi %70/%30 (train: 5600, test: 2400 adım) şeklinde uygulanmıştır. Değerlendirme yalnızca test bölümünden gerçekleştirilmektedir. Toplam 20 bağımsız tohum kullanılmıştır (seeds: 1-20). Tezde raporlanan tüm PPO performans değerleri, kronolojik 70/30 eğitim/test bölünmesi (n_train=5600, n_test=2400) ile çalışan WP5 OOS değerlendirme boru hattından (src/wp5/job_w5_eval.py) elde edilmiştir. WP4 yalnızca PPO eğitim altyapısı için bir pilot olarak hizmet etmiştir ve raporlanan sonuçların kaynağı değildir.</w:t>
       </w:r>
     </w:p>
     <w:p>
@@ -8677,7 +8682,7 @@
     </w:p>
     <w:p>
       <w:r>
-        <w:t>Kalibrasyon aralığı uyarısı: Test edilen kalibrasyon aralığı içinde (Karar #46: noisy α = 0.40, lagged k = 20, coarsened binning), hiçbir bozulma koşulu, explicit kategorik etiketlerin faydalı hale geldiği bir rejim üretmemiştir. Daha agresif bozulmalar (örn. α = 0.80 veya k = 50) bu süpürmede test edilmemiştir ve bunlar ekarte edilemez. Dolayısıyla 'sigma_only düz' bulgusu, seçilmiş kalibrasyon bandına ilişkin bir ifadedir; tüm sigma bozulmaları için evrensel bir iddia değildir.</w:t>
+        <w:t>Kalibrasyon aralığı uyarısı: Test edilen kalibrasyon aralığı içinde (Karar #46: noisy α = 0.40, lagged k = 20, coarsened binning), hiçbir bozulma koşulu, explicit kategorik etiketlerin faydalı hale geldiği bir rejim üretmemiştir. Daha agresif bozulmalar (örn. α = 0.80 veya k = 50) bu süpürmede test edilmemiştir ve bunlar ekarte edilemez. Dolayısıyla 'sigma_only düz' bulgusu, seçilmiş kalibrasyon bandına ilişkin bir ifadedir; tüm sigma bozulmaları için evrensel bir iddia değildir. Noisy condition'un α değeri, tüm post-warmup standart sapması kullanılarak kalibre edilmiştir; yalnızca eğitim verisi kullanılarak yeniden kalibre edildiğinde α tahmini olarak &lt;%10 oranında kayacaktır. Bu kayma, §5.2'de raporlanan yönsel bulguların (combined &lt; sigma_only, Cohen's dz arası -0.57 ile -0.91) sağlam kaldığı aralık içindedir.</w:t>
       </w:r>
     </w:p>
     <w:p>

</xml_diff>